<commit_message>
completed Phase 0-3c of Auto USDP Conversion Plan
</commit_message>
<xml_diff>
--- a/docs/Shareholding/BitWealth_IP_Assignment_Agreement.docx
+++ b/docs/Shareholding/BitWealth_IP_Assignment_Agreement.docx
@@ -86,7 +86,7 @@
           <w:b/>
           <w:color w:val="1A1A1A"/>
         </w:rPr>
-        <w:t>[FULL NAME OF FOUNDER]</w:t>
+        <w:t>DAVIN HARALD GAIER</w:t>
       </w:r>
     </w:p>
     <w:p>
@@ -94,15 +94,41 @@
         <w:rPr>
           <w:color w:val="1A1A1A"/>
         </w:rPr>
-        <w:t>Identity Number: [ID NUMBER]</w:t>
-      </w:r>
-    </w:p>
-    <w:p>
+        <w:t xml:space="preserve">Identity Number: </w:t>
+      </w:r>
       <w:r>
         <w:rPr>
           <w:color w:val="1A1A1A"/>
         </w:rPr>
-        <w:t>Residential Address: [PHYSICAL ADDRESS]</w:t>
+        <w:t>8405025239081</w:t>
+      </w:r>
+    </w:p>
+    <w:p>
+      <w:r>
+        <w:rPr>
+          <w:color w:val="1A1A1A"/>
+        </w:rPr>
+        <w:t xml:space="preserve">Residential Address: </w:t>
+      </w:r>
+      <w:r>
+        <w:rPr>
+          <w:color w:val="1A1A1A"/>
+        </w:rPr>
+        <w:t xml:space="preserve">89 </w:t>
+      </w:r>
+      <w:proofErr w:type="spellStart"/>
+      <w:r>
+        <w:rPr>
+          <w:color w:val="1A1A1A"/>
+        </w:rPr>
+        <w:t>Bloekom</w:t>
+      </w:r>
+      <w:proofErr w:type="spellEnd"/>
+      <w:r>
+        <w:rPr>
+          <w:color w:val="1A1A1A"/>
+        </w:rPr>
+        <w:t xml:space="preserve"> Curve, Terenure ext. 16, Kempton Park, Gauteng, South Africa, 1619</w:t>
       </w:r>
     </w:p>
     <w:p>
@@ -132,7 +158,21 @@
           <w:b/>
           <w:color w:val="1A1A1A"/>
         </w:rPr>
-        <w:t>BITWEALTH (PTY) LTD</w:t>
+        <w:t>BITWEALT</w:t>
+      </w:r>
+      <w:r>
+        <w:rPr>
+          <w:b/>
+          <w:color w:val="1A1A1A"/>
+        </w:rPr>
+        <w:t>H ASSET MANAGER</w:t>
+      </w:r>
+      <w:r>
+        <w:rPr>
+          <w:b/>
+          <w:color w:val="1A1A1A"/>
+        </w:rPr>
+        <w:t xml:space="preserve"> (PTY) LTD</w:t>
       </w:r>
     </w:p>
     <w:p>
@@ -140,15 +180,13 @@
         <w:rPr>
           <w:color w:val="1A1A1A"/>
         </w:rPr>
-        <w:t>Registration Number: [CIPC REGISTRATION NUMBER]</w:t>
-      </w:r>
-    </w:p>
-    <w:p>
+        <w:t xml:space="preserve">Registration Number: </w:t>
+      </w:r>
       <w:r>
         <w:rPr>
           <w:color w:val="1A1A1A"/>
         </w:rPr>
-        <w:t>Registered Address: [REGISTERED OFFICE ADDRESS]</w:t>
+        <w:t>2026 / 090346 / 07</w:t>
       </w:r>
     </w:p>
     <w:p>
@@ -156,7 +194,47 @@
         <w:rPr>
           <w:color w:val="1A1A1A"/>
         </w:rPr>
-        <w:t>Herein duly represented by [NAME], in his capacity as Director, duly authorised hereto</w:t>
+        <w:t xml:space="preserve">Registered Address: </w:t>
+      </w:r>
+      <w:r>
+        <w:rPr>
+          <w:color w:val="1A1A1A"/>
+        </w:rPr>
+        <w:t xml:space="preserve">89 </w:t>
+      </w:r>
+      <w:proofErr w:type="spellStart"/>
+      <w:r>
+        <w:rPr>
+          <w:color w:val="1A1A1A"/>
+        </w:rPr>
+        <w:t>Bloekom</w:t>
+      </w:r>
+      <w:proofErr w:type="spellEnd"/>
+      <w:r>
+        <w:rPr>
+          <w:color w:val="1A1A1A"/>
+        </w:rPr>
+        <w:t xml:space="preserve"> Curve, Terenure ext. 16, Kempton Park, Gauteng, South Africa, 1619</w:t>
+      </w:r>
+    </w:p>
+    <w:p>
+      <w:r>
+        <w:rPr>
+          <w:color w:val="1A1A1A"/>
+        </w:rPr>
+        <w:t xml:space="preserve">Herein duly represented by </w:t>
+      </w:r>
+      <w:r>
+        <w:rPr>
+          <w:color w:val="1A1A1A"/>
+        </w:rPr>
+        <w:t>DAVIN HARALD GAIER</w:t>
+      </w:r>
+      <w:r>
+        <w:rPr>
+          <w:color w:val="1A1A1A"/>
+        </w:rPr>
+        <w:t>, in his capacity as Director, duly authorised hereto</w:t>
       </w:r>
     </w:p>
     <w:p>
@@ -198,15 +276,39 @@
         <w:rPr>
           <w:color w:val="1A1A1A"/>
         </w:rPr>
-        <w:t>WHEREAS the Founder, in his personal capacity and prior to the incorporation of the Company, conceived, developed, and continues to develop certain proprietary intellectual property relating to a Bitcoin Dollar-Cost Averaging investment strategy known as the "Long-Term Holder Price-to-Value Ratio" or "LTH PVR" strategy, including all related software, algorithms, data models, technical infrastructure, brand assets, and documentation;</w:t>
-      </w:r>
-    </w:p>
-    <w:p>
+        <w:t>WHEREAS the Founder, in his personal capacity and prior to the incorporation of the Company, conceived, developed, and continues to develop certain proprietary intellectual property relating to a Bitcoin Dollar-Cost Averaging investment strategy known as the "Long-Term Holder Price-to-V</w:t>
+      </w:r>
       <w:r>
         <w:rPr>
           <w:color w:val="1A1A1A"/>
         </w:rPr>
-        <w:t>AND WHEREAS the Company was incorporated on [DATE OF INCORPORATION] for the purpose of commercialising the LTH PVR strategy and rendering related financial services in the Republic of South Africa under an appropriate Financial Services Provider licence;</w:t>
+        <w:t>olatility</w:t>
+      </w:r>
+      <w:r>
+        <w:rPr>
+          <w:color w:val="1A1A1A"/>
+        </w:rPr>
+        <w:t xml:space="preserve"> Ratio" or "LTH PVR" strategy, including all related software, algorithms, data models, technical infrastructure, brand assets, and documentation;</w:t>
+      </w:r>
+    </w:p>
+    <w:p>
+      <w:r>
+        <w:rPr>
+          <w:color w:val="1A1A1A"/>
+        </w:rPr>
+        <w:t xml:space="preserve">AND WHEREAS the Company was incorporated on </w:t>
+      </w:r>
+      <w:r>
+        <w:rPr>
+          <w:color w:val="1A1A1A"/>
+        </w:rPr>
+        <w:t>03 FEBRUARY 2026</w:t>
+      </w:r>
+      <w:r>
+        <w:rPr>
+          <w:color w:val="1A1A1A"/>
+        </w:rPr>
+        <w:t xml:space="preserve"> for the purpose of commercialising the LTH PVR strategy and rendering related financial services in the Republic of South Africa under an appropriate Financial Services Provider licence;</w:t>
       </w:r>
     </w:p>
     <w:p>
@@ -261,6 +363,7 @@
         <w:spacing w:after="80"/>
         <w:ind w:left="454"/>
       </w:pPr>
+      <w:proofErr w:type="gramStart"/>
       <w:r>
         <w:rPr>
           <w:b/>
@@ -268,7 +371,11 @@
         <w:t xml:space="preserve">1.1  </w:t>
       </w:r>
       <w:r>
-        <w:t>"Agreement" means this Intellectual Property Assignment Agreement, including all annexures hereto.</w:t>
+        <w:t>"</w:t>
+      </w:r>
+      <w:proofErr w:type="gramEnd"/>
+      <w:r>
+        <w:t>Agreement" means this Intellectual Property Assignment Agreement, including all annexures hereto.</w:t>
       </w:r>
     </w:p>
     <w:p>
@@ -276,6 +383,7 @@
         <w:spacing w:after="80"/>
         <w:ind w:left="454"/>
       </w:pPr>
+      <w:proofErr w:type="gramStart"/>
       <w:r>
         <w:rPr>
           <w:b/>
@@ -283,7 +391,11 @@
         <w:t xml:space="preserve">1.2  </w:t>
       </w:r>
       <w:r>
-        <w:t>"Assigned IP" means all of the Intellectual Property described in clause 2 and Annexure A, including all rights, title, and interest therein, whether registered or unregistered, existing or future, and wherever in the world such rights may subsist.</w:t>
+        <w:t>"</w:t>
+      </w:r>
+      <w:proofErr w:type="gramEnd"/>
+      <w:r>
+        <w:t>Assigned IP" means all of the Intellectual Property described in clause 2 and Annexure A, including all rights, title, and interest therein, whether registered or unregistered, existing or future, and wherever in the world such rights may subsist.</w:t>
       </w:r>
     </w:p>
     <w:p>
@@ -291,6 +403,7 @@
         <w:spacing w:after="80"/>
         <w:ind w:left="454"/>
       </w:pPr>
+      <w:proofErr w:type="gramStart"/>
       <w:r>
         <w:rPr>
           <w:b/>
@@ -298,7 +411,11 @@
         <w:t xml:space="preserve">1.3  </w:t>
       </w:r>
       <w:r>
-        <w:t>"Effective Date" means the date of last signature of this Agreement.</w:t>
+        <w:t>"</w:t>
+      </w:r>
+      <w:proofErr w:type="gramEnd"/>
+      <w:r>
+        <w:t>Effective Date" means the date of last signature of this Agreement.</w:t>
       </w:r>
     </w:p>
     <w:p>
@@ -321,6 +438,7 @@
         <w:spacing w:after="80"/>
         <w:ind w:left="454"/>
       </w:pPr>
+      <w:proofErr w:type="gramStart"/>
       <w:r>
         <w:rPr>
           <w:b/>
@@ -328,7 +446,17 @@
         <w:t xml:space="preserve">1.5  </w:t>
       </w:r>
       <w:r>
-        <w:t>"LTH PVR Strategy" means the Long-Term Holder Price-to-Value Ratio investment methodology developed by the Founder, comprising signal logic, sigma band calculations, sizing rules, sell tier logic, and bear-market pause logic, as more fully described in Annexure A.</w:t>
+        <w:t>"</w:t>
+      </w:r>
+      <w:proofErr w:type="gramEnd"/>
+      <w:r>
+        <w:t xml:space="preserve">LTH PVR Strategy" means the Long-Term Holder </w:t>
+      </w:r>
+      <w:r>
+        <w:t>Price-to-Volatility Ratio</w:t>
+      </w:r>
+      <w:r>
+        <w:t xml:space="preserve"> investment methodology developed by the Founder, comprising signal logic, sigma band calculations, sizing rules, sell tier logic, and bear-market pause logic, as more fully described in Annexure A.</w:t>
       </w:r>
     </w:p>
     <w:p>
@@ -336,6 +464,7 @@
         <w:spacing w:after="80"/>
         <w:ind w:left="454"/>
       </w:pPr>
+      <w:proofErr w:type="gramStart"/>
       <w:r>
         <w:rPr>
           <w:b/>
@@ -343,7 +472,11 @@
         <w:t xml:space="preserve">1.6  </w:t>
       </w:r>
       <w:r>
-        <w:t>"Software" means all source code, object code, scripts, configuration files, database schemas, edge functions, deployment scripts, and related technical materials forming part of the Assigned IP, as listed in Annexure B.</w:t>
+        <w:t>"</w:t>
+      </w:r>
+      <w:proofErr w:type="gramEnd"/>
+      <w:r>
+        <w:t>Software" means all source code, object code, scripts, configuration files, database schemas, edge functions, deployment scripts, and related technical materials forming part of the Assigned IP, as listed in Annexure B.</w:t>
       </w:r>
     </w:p>
     <w:p>
@@ -351,6 +484,7 @@
         <w:spacing w:after="80"/>
         <w:ind w:left="454"/>
       </w:pPr>
+      <w:proofErr w:type="gramStart"/>
       <w:r>
         <w:rPr>
           <w:b/>
@@ -358,7 +492,11 @@
         <w:t xml:space="preserve">1.7  </w:t>
       </w:r>
       <w:r>
-        <w:t>"Third-Party IP" means any intellectual property owned by a third party which forms part of, is incorporated into, or is used in connection with the Assigned IP, including open-source software components, third-party APIs, and licensed data feeds.</w:t>
+        <w:t>"</w:t>
+      </w:r>
+      <w:proofErr w:type="gramEnd"/>
+      <w:r>
+        <w:t>Third-Party IP" means any intellectual property owned by a third party which forms part of, is incorporated into, or is used in connection with the Assigned IP, including open-source software components, third-party APIs, and licensed data feeds.</w:t>
       </w:r>
     </w:p>
     <w:p>
@@ -366,6 +504,7 @@
         <w:spacing w:after="80"/>
         <w:ind w:left="454"/>
       </w:pPr>
+      <w:proofErr w:type="gramStart"/>
       <w:r>
         <w:rPr>
           <w:b/>
@@ -373,7 +512,11 @@
         <w:t xml:space="preserve">1.8  </w:t>
       </w:r>
       <w:r>
-        <w:t>Headings are for convenience only and shall not be used in the interpretation of this Agreement.</w:t>
+        <w:t>Headings</w:t>
+      </w:r>
+      <w:proofErr w:type="gramEnd"/>
+      <w:r>
+        <w:t xml:space="preserve"> are for convenience only and shall not be used in the interpretation of this Agreement.</w:t>
       </w:r>
     </w:p>
     <w:p>
@@ -381,6 +524,7 @@
         <w:spacing w:after="80"/>
         <w:ind w:left="454"/>
       </w:pPr>
+      <w:proofErr w:type="gramStart"/>
       <w:r>
         <w:rPr>
           <w:b/>
@@ -388,7 +532,11 @@
         <w:t xml:space="preserve">1.9  </w:t>
       </w:r>
       <w:r>
-        <w:t>Words importing the singular include the plural and vice versa, and words importing one gender include all genders.</w:t>
+        <w:t>Words</w:t>
+      </w:r>
+      <w:proofErr w:type="gramEnd"/>
+      <w:r>
+        <w:t xml:space="preserve"> importing the singular include the plural and vice versa, and words importing one gender include all genders.</w:t>
       </w:r>
     </w:p>
     <w:p>
@@ -417,6 +565,7 @@
         <w:spacing w:after="80"/>
         <w:ind w:left="454"/>
       </w:pPr>
+      <w:proofErr w:type="gramStart"/>
       <w:r>
         <w:rPr>
           <w:b/>
@@ -425,7 +574,11 @@
         <w:t xml:space="preserve">2.1  </w:t>
       </w:r>
       <w:r>
-        <w:t>The LTH PVR Strategy itself, including all signal logic, decision algorithms, sigma band methodology, position sizing rules (B1–B5 buy tiers and S6–S11 sell tiers), and bear-market pause logic.</w:t>
+        <w:t>The</w:t>
+      </w:r>
+      <w:proofErr w:type="gramEnd"/>
+      <w:r>
+        <w:t xml:space="preserve"> LTH PVR Strategy itself, including all signal logic, decision algorithms, sigma band methodology, position sizing rules (B1–B5 buy tiers and S6–S11 sell tiers), and bear-market pause logic.</w:t>
       </w:r>
     </w:p>
     <w:p>
@@ -440,7 +593,85 @@
         <w:t xml:space="preserve">2.2  </w:t>
       </w:r>
       <w:r>
-        <w:t>All Software comprising the LTH PVR execution platform, including but not limited to: the Supabase database schema and all migrations; all Deno edge functions (including but not limited to ef_fetch_ci_bands, ef_generate_decisions, ef_create_order_intents, ef_execute_orders, ef_poll_orders, ef_post_ledger_and_balances, ef_alert_digest, ef_valr_ws_monitor, and ef_resume_pipeline); the administrative and client-facing user interfaces; the back-testing engine; and all associated PowerShell deployment scripts.</w:t>
+        <w:t xml:space="preserve">All Software comprising the LTH PVR execution platform, including but not limited to: the </w:t>
+      </w:r>
+      <w:proofErr w:type="spellStart"/>
+      <w:r>
+        <w:t>Supabase</w:t>
+      </w:r>
+      <w:proofErr w:type="spellEnd"/>
+      <w:r>
+        <w:t xml:space="preserve"> database schema and all migrations; all Deno edge functions (including but not limited to </w:t>
+      </w:r>
+      <w:proofErr w:type="spellStart"/>
+      <w:r>
+        <w:t>ef_fetch_</w:t>
+      </w:r>
+      <w:r>
+        <w:t>rb</w:t>
+      </w:r>
+      <w:r>
+        <w:t>_bands</w:t>
+      </w:r>
+      <w:proofErr w:type="spellEnd"/>
+      <w:r>
+        <w:t xml:space="preserve">, </w:t>
+      </w:r>
+      <w:proofErr w:type="spellStart"/>
+      <w:r>
+        <w:t>ef_generate_decisions</w:t>
+      </w:r>
+      <w:proofErr w:type="spellEnd"/>
+      <w:r>
+        <w:t xml:space="preserve">, </w:t>
+      </w:r>
+      <w:proofErr w:type="spellStart"/>
+      <w:r>
+        <w:t>ef_create_order_intents</w:t>
+      </w:r>
+      <w:proofErr w:type="spellEnd"/>
+      <w:r>
+        <w:t xml:space="preserve">, </w:t>
+      </w:r>
+      <w:proofErr w:type="spellStart"/>
+      <w:r>
+        <w:t>ef_execute_orders</w:t>
+      </w:r>
+      <w:proofErr w:type="spellEnd"/>
+      <w:r>
+        <w:t xml:space="preserve">, </w:t>
+      </w:r>
+      <w:proofErr w:type="spellStart"/>
+      <w:r>
+        <w:t>ef_poll_orders</w:t>
+      </w:r>
+      <w:proofErr w:type="spellEnd"/>
+      <w:r>
+        <w:t xml:space="preserve">, </w:t>
+      </w:r>
+      <w:proofErr w:type="spellStart"/>
+      <w:r>
+        <w:t>ef_post_ledger_and_balances</w:t>
+      </w:r>
+      <w:proofErr w:type="spellEnd"/>
+      <w:r>
+        <w:t xml:space="preserve">, </w:t>
+      </w:r>
+      <w:proofErr w:type="spellStart"/>
+      <w:r>
+        <w:t>ef_alert_digest</w:t>
+      </w:r>
+      <w:proofErr w:type="spellEnd"/>
+      <w:r>
+        <w:t xml:space="preserve">, and </w:t>
+      </w:r>
+      <w:proofErr w:type="spellStart"/>
+      <w:r>
+        <w:t>ef_resume_pipeline</w:t>
+      </w:r>
+      <w:proofErr w:type="spellEnd"/>
+      <w:r>
+        <w:t>); the administrative and client-facing user interfaces; the back-testing engine; and all associated PowerShell deployment scripts.</w:t>
       </w:r>
     </w:p>
     <w:p>
@@ -448,6 +679,7 @@
         <w:spacing w:after="80"/>
         <w:ind w:left="454"/>
       </w:pPr>
+      <w:proofErr w:type="gramStart"/>
       <w:r>
         <w:rPr>
           <w:b/>
@@ -455,7 +687,11 @@
         <w:t xml:space="preserve">2.3  </w:t>
       </w:r>
       <w:r>
-        <w:t>All technical and product documentation, including the Solution Design Document (SDD), test case documents, deployment guides, and architectural specifications.</w:t>
+        <w:t>All</w:t>
+      </w:r>
+      <w:proofErr w:type="gramEnd"/>
+      <w:r>
+        <w:t xml:space="preserve"> technical and product documentation, including the Solution Design Document (SDD), test case documents, deployment guides, and architectural specifications.</w:t>
       </w:r>
     </w:p>
     <w:p>
@@ -463,6 +699,7 @@
         <w:spacing w:after="80"/>
         <w:ind w:left="454"/>
       </w:pPr>
+      <w:proofErr w:type="gramStart"/>
       <w:r>
         <w:rPr>
           <w:b/>
@@ -470,7 +707,11 @@
         <w:t xml:space="preserve">2.4  </w:t>
       </w:r>
       <w:r>
-        <w:t>All brand assets, including the "BitWealth" name, logos, trade dress, marketing collateral, the ABC One-Pager, and any other client-facing materials.</w:t>
+        <w:t>All</w:t>
+      </w:r>
+      <w:proofErr w:type="gramEnd"/>
+      <w:r>
+        <w:t xml:space="preserve"> brand assets, including the "BitWealth" name, logos, trade dress, marketing collateral, the ABC One-Pager, and any other client-facing materials.</w:t>
       </w:r>
     </w:p>
     <w:p>
@@ -478,6 +719,7 @@
         <w:spacing w:after="80"/>
         <w:ind w:left="454"/>
       </w:pPr>
+      <w:proofErr w:type="gramStart"/>
       <w:r>
         <w:rPr>
           <w:b/>
@@ -485,7 +727,31 @@
         <w:t xml:space="preserve">2.5  </w:t>
       </w:r>
       <w:r>
-        <w:t>All domain names, social media handles, exchange-account integrations, and third-party platform accounts (including but not limited to GitHub, Supabase, CryptoQuant, VALR, Resend, and Netlify) used in connection with the LTH PVR Strategy and the business of the Company.</w:t>
+        <w:t>All</w:t>
+      </w:r>
+      <w:proofErr w:type="gramEnd"/>
+      <w:r>
+        <w:t xml:space="preserve"> domain names, social media handles, exchange-account integrations, and third-party platform accounts (including but not limited to GitHub, </w:t>
+      </w:r>
+      <w:proofErr w:type="spellStart"/>
+      <w:r>
+        <w:t>Supabase</w:t>
+      </w:r>
+      <w:proofErr w:type="spellEnd"/>
+      <w:r>
+        <w:t xml:space="preserve">, </w:t>
+      </w:r>
+      <w:r>
+        <w:t>Research Bitcoin</w:t>
+      </w:r>
+      <w:r>
+        <w:t xml:space="preserve">, VALR, </w:t>
+      </w:r>
+      <w:r>
+        <w:t>Domains.co.za</w:t>
+      </w:r>
+      <w:r>
+        <w:t>, and Netlify) used in connection with the LTH PVR Strategy and the business of the Company.</w:t>
       </w:r>
     </w:p>
     <w:p>
@@ -493,6 +759,7 @@
         <w:spacing w:after="80"/>
         <w:ind w:left="454"/>
       </w:pPr>
+      <w:proofErr w:type="gramStart"/>
       <w:r>
         <w:rPr>
           <w:b/>
@@ -500,7 +767,11 @@
         <w:t xml:space="preserve">2.6  </w:t>
       </w:r>
       <w:r>
-        <w:t>All historical back-test data, model outputs, performance reports, and analytical work product produced in the course of developing the LTH PVR Strategy.</w:t>
+        <w:t>All</w:t>
+      </w:r>
+      <w:proofErr w:type="gramEnd"/>
+      <w:r>
+        <w:t xml:space="preserve"> historical back-test data, model outputs, performance reports, and analytical work product produced in the course of developing the LTH PVR Strategy.</w:t>
       </w:r>
     </w:p>
     <w:p>
@@ -508,6 +779,7 @@
         <w:spacing w:after="80"/>
         <w:ind w:left="454"/>
       </w:pPr>
+      <w:proofErr w:type="gramStart"/>
       <w:r>
         <w:rPr>
           <w:b/>
@@ -515,7 +787,11 @@
         <w:t xml:space="preserve">2.7  </w:t>
       </w:r>
       <w:r>
-        <w:t>A complete inventory of the Assigned IP is set out in Annexure A. To the extent that any item of intellectual property created by the Founder prior to the Effective Date and relating to the business of the Company is not specifically listed in Annexure A, such item shall nevertheless form part of the Assigned IP and shall be deemed assigned to the Company under this Agreement.</w:t>
+        <w:t>A</w:t>
+      </w:r>
+      <w:proofErr w:type="gramEnd"/>
+      <w:r>
+        <w:t xml:space="preserve"> complete inventory of the Assigned IP is set out in Annexure A. To the extent that any item of intellectual property created by the Founder prior to the Effective Date and relating to the business of the Company is not specifically listed in Annexure A, such item shall nevertheless form part of the Assigned IP and shall be deemed assigned to the Company under this Agreement.</w:t>
       </w:r>
     </w:p>
     <w:p>
@@ -536,6 +812,7 @@
         <w:spacing w:after="80"/>
         <w:ind w:left="454"/>
       </w:pPr>
+      <w:proofErr w:type="gramStart"/>
       <w:r>
         <w:rPr>
           <w:b/>
@@ -543,7 +820,11 @@
         <w:t xml:space="preserve">3.1  </w:t>
       </w:r>
       <w:r>
-        <w:t>With effect from the Effective Date, the Founder hereby irrevocably and unconditionally assigns, transfers, and conveys to the Company, free of any encumbrance, all of his right, title, and interest in and to the Assigned IP, together with all goodwill associated therewith, for the full term of any rights subsisting therein and any extensions or renewals thereof, in all jurisdictions worldwide.</w:t>
+        <w:t>With</w:t>
+      </w:r>
+      <w:proofErr w:type="gramEnd"/>
+      <w:r>
+        <w:t xml:space="preserve"> effect from the Effective Date, the Founder hereby irrevocably and unconditionally assigns, transfers, and conveys to the Company, free of any encumbrance, all of his right, title, and interest in and to the Assigned IP, together with all goodwill associated therewith, for the full term of any rights subsisting therein and any extensions or renewals thereof, in all jurisdictions worldwide.</w:t>
       </w:r>
     </w:p>
     <w:p>
@@ -551,6 +832,7 @@
         <w:spacing w:after="80"/>
         <w:ind w:left="454"/>
       </w:pPr>
+      <w:proofErr w:type="gramStart"/>
       <w:r>
         <w:rPr>
           <w:b/>
@@ -558,7 +840,11 @@
         <w:t xml:space="preserve">3.2  </w:t>
       </w:r>
       <w:r>
-        <w:t>The assignment in clause 3.1 includes the right to sue for and recover damages, profits, and any other remedies in respect of any infringement of the Assigned IP occurring before, on, or after the Effective Date.</w:t>
+        <w:t>The</w:t>
+      </w:r>
+      <w:proofErr w:type="gramEnd"/>
+      <w:r>
+        <w:t xml:space="preserve"> assignment in clause 3.1 includes the right to sue for and recover damages, profits, and any other remedies in respect of any infringement of the Assigned IP occurring before, on, or after the Effective Date.</w:t>
       </w:r>
     </w:p>
     <w:p>
@@ -566,6 +852,7 @@
         <w:spacing w:after="80"/>
         <w:ind w:left="454"/>
       </w:pPr>
+      <w:proofErr w:type="gramStart"/>
       <w:r>
         <w:rPr>
           <w:b/>
@@ -573,7 +860,11 @@
         <w:t xml:space="preserve">3.3  </w:t>
       </w:r>
       <w:r>
-        <w:t>The Founder hereby waives, to the maximum extent permitted by law, all moral rights he may have in any copyright works forming part of the Assigned IP.</w:t>
+        <w:t>The</w:t>
+      </w:r>
+      <w:proofErr w:type="gramEnd"/>
+      <w:r>
+        <w:t xml:space="preserve"> Founder hereby waives, to the maximum extent permitted by law, all moral rights he may have in any copyright works forming part of the Assigned IP.</w:t>
       </w:r>
     </w:p>
     <w:p>
@@ -581,6 +872,7 @@
         <w:spacing w:after="80"/>
         <w:ind w:left="454"/>
       </w:pPr>
+      <w:proofErr w:type="gramStart"/>
       <w:r>
         <w:rPr>
           <w:b/>
@@ -588,7 +880,11 @@
         <w:t xml:space="preserve">3.4  </w:t>
       </w:r>
       <w:r>
-        <w:t>The Company accepts the assignment on the terms set out in this Agreement.</w:t>
+        <w:t>The</w:t>
+      </w:r>
+      <w:proofErr w:type="gramEnd"/>
+      <w:r>
+        <w:t xml:space="preserve"> Company accepts the assignment on the terms set out in this Agreement.</w:t>
       </w:r>
     </w:p>
     <w:p>
@@ -609,6 +905,7 @@
         <w:spacing w:after="80"/>
         <w:ind w:left="454"/>
       </w:pPr>
+      <w:proofErr w:type="gramStart"/>
       <w:r>
         <w:rPr>
           <w:b/>
@@ -616,7 +913,11 @@
         <w:t xml:space="preserve">4.1  </w:t>
       </w:r>
       <w:r>
-        <w:t>In consideration for the assignment effected by this Agreement, the Company shall pay or provide to the Founder the consideration set out in this clause 4.</w:t>
+        <w:t>In</w:t>
+      </w:r>
+      <w:proofErr w:type="gramEnd"/>
+      <w:r>
+        <w:t xml:space="preserve"> consideration for the assignment effected by this Agreement, the Company shall pay or provide to the Founder the consideration set out in this clause 4.</w:t>
       </w:r>
     </w:p>
     <w:p>
@@ -624,6 +925,7 @@
         <w:spacing w:after="80"/>
         <w:ind w:left="454"/>
       </w:pPr>
+      <w:proofErr w:type="gramStart"/>
       <w:r>
         <w:rPr>
           <w:b/>
@@ -631,7 +933,11 @@
         <w:t xml:space="preserve">4.2  </w:t>
       </w:r>
       <w:r>
-        <w:t>[OPTION A — NOMINAL CONSIDERATION] The Company shall pay to the Founder a nominal cash consideration of R 100.00 (One Hundred Rand), the receipt of which is hereby acknowledged.</w:t>
+        <w:t>[</w:t>
+      </w:r>
+      <w:proofErr w:type="gramEnd"/>
+      <w:r>
+        <w:t>OPTION A — NOMINAL CONSIDERATION] The Company shall pay to the Founder a nominal cash consideration of R 100.00 (One Hundred Rand), the receipt of which is hereby acknowledged.</w:t>
       </w:r>
     </w:p>
     <w:p>
@@ -639,6 +945,7 @@
         <w:spacing w:after="80"/>
         <w:ind w:left="454"/>
       </w:pPr>
+      <w:proofErr w:type="gramStart"/>
       <w:r>
         <w:rPr>
           <w:b/>
@@ -646,7 +953,11 @@
         <w:t xml:space="preserve">4.3  </w:t>
       </w:r>
       <w:r>
-        <w:t>[OPTION B — SHARE-BASED CONSIDERATION] The Company shall issue to the Founder [NUMBER] ordinary shares in the share capital of the Company, credited as fully paid up, on the Effective Date.</w:t>
+        <w:t>[</w:t>
+      </w:r>
+      <w:proofErr w:type="gramEnd"/>
+      <w:r>
+        <w:t>OPTION B — SHARE-BASED CONSIDERATION] The Company shall issue to the Founder [NUMBER] ordinary shares in the share capital of the Company, credited as fully paid up, on the Effective Date.</w:t>
       </w:r>
     </w:p>
     <w:p>
@@ -654,6 +965,7 @@
         <w:spacing w:after="80"/>
         <w:ind w:left="454"/>
       </w:pPr>
+      <w:proofErr w:type="gramStart"/>
       <w:r>
         <w:rPr>
           <w:b/>
@@ -662,7 +974,11 @@
         <w:t xml:space="preserve">4.4  </w:t>
       </w:r>
       <w:r>
-        <w:t xml:space="preserve">[OPTION C — DEFERRED / LOAN ACCOUNT] The Company shall credit the Founder's shareholder loan account in the amount of R </w:t>
+        <w:t>[</w:t>
+      </w:r>
+      <w:proofErr w:type="gramEnd"/>
+      <w:r>
+        <w:t xml:space="preserve">OPTION C — DEFERRED / LOAN ACCOUNT] The Company shall credit the Founder's shareholder loan account in the amount of R </w:t>
       </w:r>
       <w:r>
         <w:t>2,000,000.00 (Two Million Rand)</w:t>
@@ -676,6 +992,7 @@
         <w:spacing w:after="80"/>
         <w:ind w:left="454"/>
       </w:pPr>
+      <w:proofErr w:type="gramStart"/>
       <w:r>
         <w:rPr>
           <w:b/>
@@ -683,7 +1000,11 @@
         <w:t xml:space="preserve">4.5  </w:t>
       </w:r>
       <w:r>
-        <w:t>The Parties acknowledge that the consideration set out above represents fair and adequate value for the assignment, having regard to the Founder's ongoing role as a shareholder, director, and beneficiary of the Company's commercialisation of the Assigned IP.</w:t>
+        <w:t>The</w:t>
+      </w:r>
+      <w:proofErr w:type="gramEnd"/>
+      <w:r>
+        <w:t xml:space="preserve"> Parties acknowledge that the consideration set out above represents fair and adequate value for the assignment, having regard to the Founder's ongoing role as a shareholder, director, and beneficiary of the Company's commercialisation of the Assigned IP.</w:t>
       </w:r>
     </w:p>
     <w:p>
@@ -720,6 +1041,7 @@
         <w:spacing w:after="80"/>
         <w:ind w:left="454"/>
       </w:pPr>
+      <w:proofErr w:type="gramStart"/>
       <w:r>
         <w:rPr>
           <w:b/>
@@ -727,7 +1049,11 @@
         <w:t xml:space="preserve">5.1  </w:t>
       </w:r>
       <w:r>
-        <w:t>He is the sole legal and beneficial owner of the Assigned IP, and has full power, authority, and right to assign the Assigned IP to the Company free of any encumbrance.</w:t>
+        <w:t>He</w:t>
+      </w:r>
+      <w:proofErr w:type="gramEnd"/>
+      <w:r>
+        <w:t xml:space="preserve"> is the sole legal and beneficial owner of the Assigned IP, and has full power, authority, and right to assign the Assigned IP to the Company free of any encumbrance.</w:t>
       </w:r>
     </w:p>
     <w:p>
@@ -735,6 +1061,7 @@
         <w:spacing w:after="80"/>
         <w:ind w:left="454"/>
       </w:pPr>
+      <w:proofErr w:type="gramStart"/>
       <w:r>
         <w:rPr>
           <w:b/>
@@ -742,7 +1069,11 @@
         <w:t xml:space="preserve">5.2  </w:t>
       </w:r>
       <w:r>
-        <w:t>The Assigned IP is original to the Founder and, to the best of his knowledge after reasonable enquiry, does not infringe the intellectual property rights of any third party, save for the Third-Party IP identified in Annexure C.</w:t>
+        <w:t>The</w:t>
+      </w:r>
+      <w:proofErr w:type="gramEnd"/>
+      <w:r>
+        <w:t xml:space="preserve"> Assigned IP is original to the Founder and, to the best of his knowledge after reasonable enquiry, does not infringe the intellectual property rights of any third party, save for the Third-Party IP identified in Annexure C.</w:t>
       </w:r>
     </w:p>
     <w:p>
@@ -750,6 +1081,7 @@
         <w:spacing w:after="80"/>
         <w:ind w:left="454"/>
       </w:pPr>
+      <w:proofErr w:type="gramStart"/>
       <w:r>
         <w:rPr>
           <w:b/>
@@ -757,7 +1089,11 @@
         <w:t xml:space="preserve">5.3  </w:t>
       </w:r>
       <w:r>
-        <w:t>No third party has any claim, right, licence, option, or interest in or to the Assigned IP other than as disclosed in Annexure C.</w:t>
+        <w:t>No</w:t>
+      </w:r>
+      <w:proofErr w:type="gramEnd"/>
+      <w:r>
+        <w:t xml:space="preserve"> third party has any claim, right, licence, option, or interest in or to the Assigned IP other than as disclosed in Annexure C.</w:t>
       </w:r>
     </w:p>
     <w:p>
@@ -765,6 +1101,7 @@
         <w:spacing w:after="80"/>
         <w:ind w:left="454"/>
       </w:pPr>
+      <w:proofErr w:type="gramStart"/>
       <w:r>
         <w:rPr>
           <w:b/>
@@ -772,7 +1109,11 @@
         <w:t xml:space="preserve">5.4  </w:t>
       </w:r>
       <w:r>
-        <w:t>No part of the Assigned IP was created during the course of any employment, consultancy, or contractor engagement with any third party that would entitle such third party to claim ownership of, or rights in, the Assigned IP.</w:t>
+        <w:t>No</w:t>
+      </w:r>
+      <w:proofErr w:type="gramEnd"/>
+      <w:r>
+        <w:t xml:space="preserve"> part of the Assigned IP was created during the course of any employment, consultancy, or contractor engagement with any third party that would entitle such third party to claim ownership of, or rights in, the Assigned IP.</w:t>
       </w:r>
     </w:p>
     <w:p>
@@ -780,6 +1121,7 @@
         <w:spacing w:after="80"/>
         <w:ind w:left="454"/>
       </w:pPr>
+      <w:proofErr w:type="gramStart"/>
       <w:r>
         <w:rPr>
           <w:b/>
@@ -787,7 +1129,11 @@
         <w:t xml:space="preserve">5.5  </w:t>
       </w:r>
       <w:r>
-        <w:t>There are no pending or threatened legal proceedings, disputes, or claims relating to the Assigned IP.</w:t>
+        <w:t>There</w:t>
+      </w:r>
+      <w:proofErr w:type="gramEnd"/>
+      <w:r>
+        <w:t xml:space="preserve"> are no pending or threatened legal proceedings, disputes, or claims relating to the Assigned IP.</w:t>
       </w:r>
     </w:p>
     <w:p>
@@ -795,6 +1141,7 @@
         <w:spacing w:after="80"/>
         <w:ind w:left="454"/>
       </w:pPr>
+      <w:proofErr w:type="gramStart"/>
       <w:r>
         <w:rPr>
           <w:b/>
@@ -802,7 +1149,11 @@
         <w:t xml:space="preserve">5.6  </w:t>
       </w:r>
       <w:r>
-        <w:t>All open-source software components incorporated into the Software have been used in compliance with their respective licence terms, and a list of such components is set out in Annexure C.</w:t>
+        <w:t>All</w:t>
+      </w:r>
+      <w:proofErr w:type="gramEnd"/>
+      <w:r>
+        <w:t xml:space="preserve"> open-source software components incorporated into the Software have been used in compliance with their respective licence terms, and a list of such components is set out in Annexure C.</w:t>
       </w:r>
     </w:p>
     <w:p>
@@ -823,6 +1174,7 @@
         <w:spacing w:after="80"/>
         <w:ind w:left="454"/>
       </w:pPr>
+      <w:proofErr w:type="gramStart"/>
       <w:r>
         <w:rPr>
           <w:b/>
@@ -830,7 +1182,27 @@
         <w:t xml:space="preserve">6.1  </w:t>
       </w:r>
       <w:r>
-        <w:t>The Parties acknowledge that the Software incorporates certain Third-Party IP, including open-source libraries and third-party API integrations (including without limitation CryptoQuant, VALR, Supabase, and Resend), as listed in Annexure C.</w:t>
+        <w:t>The</w:t>
+      </w:r>
+      <w:proofErr w:type="gramEnd"/>
+      <w:r>
+        <w:t xml:space="preserve"> Parties acknowledge that the Software incorporates certain Third-Party IP, including open-source libraries and third-party API integrations (including without limitation </w:t>
+      </w:r>
+      <w:proofErr w:type="spellStart"/>
+      <w:r>
+        <w:t>CryptoQuant</w:t>
+      </w:r>
+      <w:proofErr w:type="spellEnd"/>
+      <w:r>
+        <w:t xml:space="preserve">, VALR, </w:t>
+      </w:r>
+      <w:proofErr w:type="spellStart"/>
+      <w:r>
+        <w:t>Supabase</w:t>
+      </w:r>
+      <w:proofErr w:type="spellEnd"/>
+      <w:r>
+        <w:t>, and Resend), as listed in Annexure C.</w:t>
       </w:r>
     </w:p>
     <w:p>
@@ -838,6 +1210,7 @@
         <w:spacing w:after="80"/>
         <w:ind w:left="454"/>
       </w:pPr>
+      <w:proofErr w:type="gramStart"/>
       <w:r>
         <w:rPr>
           <w:b/>
@@ -845,7 +1218,11 @@
         <w:t xml:space="preserve">6.2  </w:t>
       </w:r>
       <w:r>
-        <w:t>The Founder confirms that all Third-Party IP has been used in accordance with its applicable licence terms, and the Company shall continue to comply with such terms following the Effective Date.</w:t>
+        <w:t>The</w:t>
+      </w:r>
+      <w:proofErr w:type="gramEnd"/>
+      <w:r>
+        <w:t xml:space="preserve"> Founder confirms that all Third-Party IP has been used in accordance with its applicable licence terms, and the Company shall continue to comply with such terms following the Effective Date.</w:t>
       </w:r>
     </w:p>
     <w:p>
@@ -853,6 +1230,7 @@
         <w:spacing w:after="80"/>
         <w:ind w:left="454"/>
       </w:pPr>
+      <w:proofErr w:type="gramStart"/>
       <w:r>
         <w:rPr>
           <w:b/>
@@ -860,7 +1238,11 @@
         <w:t xml:space="preserve">6.3  </w:t>
       </w:r>
       <w:r>
-        <w:t>No Third-Party IP is assigned under this Agreement; the Company shall obtain its own licences to use such Third-Party IP from the relevant third parties on an ongoing basis.</w:t>
+        <w:t>No</w:t>
+      </w:r>
+      <w:proofErr w:type="gramEnd"/>
+      <w:r>
+        <w:t xml:space="preserve"> Third-Party IP is assigned under this Agreement; the Company shall obtain its own licences to use such Third-Party IP from the relevant third parties on an ongoing basis.</w:t>
       </w:r>
     </w:p>
     <w:p>
@@ -915,6 +1297,7 @@
         <w:spacing w:after="80"/>
         <w:ind w:left="454"/>
       </w:pPr>
+      <w:proofErr w:type="gramStart"/>
       <w:r>
         <w:rPr>
           <w:b/>
@@ -922,7 +1305,11 @@
         <w:t xml:space="preserve">7.3  </w:t>
       </w:r>
       <w:r>
-        <w:t>The Founder hereby appoints the Company as his attorney and agent to execute any document and take any action contemplated by clause 7.2 in the event that the Founder fails or refuses to do so within a reasonable time after request.</w:t>
+        <w:t>The</w:t>
+      </w:r>
+      <w:proofErr w:type="gramEnd"/>
+      <w:r>
+        <w:t xml:space="preserve"> Founder hereby appoints the Company as his attorney and agent to execute any document and take any action contemplated by clause 7.2 in the event that the Founder fails or refuses to do so within a reasonable time after request.</w:t>
       </w:r>
     </w:p>
     <w:p>
@@ -943,6 +1330,7 @@
         <w:spacing w:after="80"/>
         <w:ind w:left="454"/>
       </w:pPr>
+      <w:proofErr w:type="gramStart"/>
       <w:r>
         <w:rPr>
           <w:b/>
@@ -950,7 +1338,11 @@
         <w:t xml:space="preserve">8.1  </w:t>
       </w:r>
       <w:r>
-        <w:t>The Founder shall keep all information relating to the Assigned IP, including without limitation the Software source code, the LTH PVR signal logic, client data, and the Company's business plans and strategy, strictly confidential, and shall not disclose such information to any third party without the prior written consent of the Company.</w:t>
+        <w:t>The</w:t>
+      </w:r>
+      <w:proofErr w:type="gramEnd"/>
+      <w:r>
+        <w:t xml:space="preserve"> Founder shall keep all information relating to the Assigned IP, including without limitation the Software source code, the LTH PVR signal logic, client data, and the Company's business plans and strategy, strictly confidential, and shall not disclose such information to any third party without the prior written consent of the Company.</w:t>
       </w:r>
     </w:p>
     <w:p>
@@ -958,6 +1350,7 @@
         <w:spacing w:after="80"/>
         <w:ind w:left="454"/>
       </w:pPr>
+      <w:proofErr w:type="gramStart"/>
       <w:r>
         <w:rPr>
           <w:b/>
@@ -965,7 +1358,11 @@
         <w:t xml:space="preserve">8.2  </w:t>
       </w:r>
       <w:r>
-        <w:t>This obligation of confidentiality shall survive the termination of any employment, directorship, or shareholder relationship between the Founder and the Company.</w:t>
+        <w:t>This</w:t>
+      </w:r>
+      <w:proofErr w:type="gramEnd"/>
+      <w:r>
+        <w:t xml:space="preserve"> obligation of confidentiality shall survive the termination of any employment, directorship, or shareholder relationship between the Founder and the Company.</w:t>
       </w:r>
     </w:p>
     <w:p>
@@ -973,6 +1370,7 @@
         <w:spacing w:after="80"/>
         <w:ind w:left="454"/>
       </w:pPr>
+      <w:proofErr w:type="gramStart"/>
       <w:r>
         <w:rPr>
           <w:b/>
@@ -980,7 +1378,11 @@
         <w:t xml:space="preserve">8.3  </w:t>
       </w:r>
       <w:r>
-        <w:t>The obligation of confidentiality shall not apply to information which is or becomes publicly available other than through a breach of this Agreement, or which the Founder is required to disclose by law or by order of a competent court.</w:t>
+        <w:t>The</w:t>
+      </w:r>
+      <w:proofErr w:type="gramEnd"/>
+      <w:r>
+        <w:t xml:space="preserve"> obligation of confidentiality shall not apply to information which is or becomes publicly available other than through a breach of this Agreement, or which the Founder is required to disclose by law or by order of a competent court.</w:t>
       </w:r>
     </w:p>
     <w:p>
@@ -1016,6 +1418,7 @@
         <w:spacing w:after="80"/>
         <w:ind w:left="454"/>
       </w:pPr>
+      <w:proofErr w:type="gramStart"/>
       <w:r>
         <w:rPr>
           <w:b/>
@@ -1023,7 +1426,11 @@
         <w:t xml:space="preserve">9.2  </w:t>
       </w:r>
       <w:r>
-        <w:t>The Parties acknowledge that this restraint is reasonable in scope, duration, and geography, having regard to the value of the Assigned IP and the legitimate proprietary interests of the Company.</w:t>
+        <w:t>The</w:t>
+      </w:r>
+      <w:proofErr w:type="gramEnd"/>
+      <w:r>
+        <w:t xml:space="preserve"> Parties acknowledge that this restraint is reasonable in scope, duration, and geography, having regard to the value of the Assigned IP and the legitimate proprietary interests of the Company.</w:t>
       </w:r>
     </w:p>
     <w:p>
@@ -1052,6 +1459,7 @@
         <w:spacing w:after="80"/>
         <w:ind w:left="454"/>
       </w:pPr>
+      <w:proofErr w:type="gramStart"/>
       <w:r>
         <w:rPr>
           <w:b/>
@@ -1059,7 +1467,11 @@
         <w:t xml:space="preserve">10.1  </w:t>
       </w:r>
       <w:r>
-        <w:t>The Founder indemnifies and holds the Company harmless against any loss, damage, claim, or expense (including reasonable legal costs) suffered or incurred by the Company arising out of or in connection with any breach of the warranties given by the Founder in clause 5.</w:t>
+        <w:t>The</w:t>
+      </w:r>
+      <w:proofErr w:type="gramEnd"/>
+      <w:r>
+        <w:t xml:space="preserve"> Founder indemnifies and holds the Company harmless against any loss, damage, claim, or expense (including reasonable legal costs) suffered or incurred by the Company arising out of or in connection with any breach of the warranties given by the Founder in clause 5.</w:t>
       </w:r>
     </w:p>
     <w:p>
@@ -1067,6 +1479,7 @@
         <w:spacing w:after="80"/>
         <w:ind w:left="454"/>
       </w:pPr>
+      <w:proofErr w:type="gramStart"/>
       <w:r>
         <w:rPr>
           <w:b/>
@@ -1074,7 +1487,11 @@
         <w:t xml:space="preserve">10.2  </w:t>
       </w:r>
       <w:r>
-        <w:t>The Founder's liability under this indemnity shall be capped at the value of the consideration received under clause 4, save in the case of fraud or wilful misconduct.</w:t>
+        <w:t>The</w:t>
+      </w:r>
+      <w:proofErr w:type="gramEnd"/>
+      <w:r>
+        <w:t xml:space="preserve"> Founder's liability under this indemnity shall be capped at the value of the consideration received under clause 4, save in the case of fraud or wilful misconduct.</w:t>
       </w:r>
     </w:p>
     <w:p>
@@ -1096,6 +1513,7 @@
         <w:spacing w:after="80"/>
         <w:ind w:left="454"/>
       </w:pPr>
+      <w:proofErr w:type="gramStart"/>
       <w:r>
         <w:rPr>
           <w:b/>
@@ -1103,7 +1521,11 @@
         <w:t xml:space="preserve">11.1  </w:t>
       </w:r>
       <w:r>
-        <w:t>Each Party shall be responsible for its own tax liabilities arising from this Agreement, including without limitation any capital gains tax, income tax, value-added tax, or securities transfer tax.</w:t>
+        <w:t>Each</w:t>
+      </w:r>
+      <w:proofErr w:type="gramEnd"/>
+      <w:r>
+        <w:t xml:space="preserve"> Party shall be responsible for its own tax liabilities arising from this Agreement, including without limitation any capital gains tax, income tax, value-added tax, or securities transfer tax.</w:t>
       </w:r>
     </w:p>
     <w:p>
@@ -1111,6 +1533,7 @@
         <w:spacing w:after="80"/>
         <w:ind w:left="454"/>
       </w:pPr>
+      <w:proofErr w:type="gramStart"/>
       <w:r>
         <w:rPr>
           <w:b/>
@@ -1118,7 +1541,11 @@
         <w:t xml:space="preserve">11.2  </w:t>
       </w:r>
       <w:r>
-        <w:t>The Parties shall co-operate in good faith in obtaining any tax clearances or making any tax filings required as a consequence of this Agreement.</w:t>
+        <w:t>The</w:t>
+      </w:r>
+      <w:proofErr w:type="gramEnd"/>
+      <w:r>
+        <w:t xml:space="preserve"> Parties shall co-operate in good faith in obtaining any tax clearances or making any tax filings required as a consequence of this Agreement.</w:t>
       </w:r>
     </w:p>
     <w:p>
@@ -1147,6 +1574,7 @@
         <w:spacing w:after="80"/>
         <w:ind w:left="454"/>
       </w:pPr>
+      <w:proofErr w:type="gramStart"/>
       <w:r>
         <w:rPr>
           <w:b/>
@@ -1154,7 +1582,11 @@
         <w:t xml:space="preserve">12.1  </w:t>
       </w:r>
       <w:r>
-        <w:t>Entire Agreement. This Agreement constitutes the entire agreement between the Parties in respect of its subject matter and supersedes all prior negotiations, understandings, and agreements.</w:t>
+        <w:t>Entire</w:t>
+      </w:r>
+      <w:proofErr w:type="gramEnd"/>
+      <w:r>
+        <w:t xml:space="preserve"> Agreement. This Agreement constitutes the entire agreement between the Parties in respect of its subject matter and supersedes all prior negotiations, understandings, and agreements.</w:t>
       </w:r>
     </w:p>
     <w:p>
@@ -1162,6 +1594,7 @@
         <w:spacing w:after="80"/>
         <w:ind w:left="454"/>
       </w:pPr>
+      <w:proofErr w:type="gramStart"/>
       <w:r>
         <w:rPr>
           <w:b/>
@@ -1169,7 +1602,11 @@
         <w:t xml:space="preserve">12.2  </w:t>
       </w:r>
       <w:r>
-        <w:t>Amendment. No amendment to this Agreement shall be of any force or effect unless reduced to writing and signed by both Parties.</w:t>
+        <w:t>Amendment</w:t>
+      </w:r>
+      <w:proofErr w:type="gramEnd"/>
+      <w:r>
+        <w:t>. No amendment to this Agreement shall be of any force or effect unless reduced to writing and signed by both Parties.</w:t>
       </w:r>
     </w:p>
     <w:p>
@@ -1177,6 +1614,7 @@
         <w:spacing w:after="80"/>
         <w:ind w:left="454"/>
       </w:pPr>
+      <w:proofErr w:type="gramStart"/>
       <w:r>
         <w:rPr>
           <w:b/>
@@ -1184,7 +1622,11 @@
         <w:t xml:space="preserve">12.3  </w:t>
       </w:r>
       <w:r>
-        <w:t>Severability. If any provision of this Agreement is held to be invalid or unenforceable, the remaining provisions shall continue in full force and effect.</w:t>
+        <w:t>Severability</w:t>
+      </w:r>
+      <w:proofErr w:type="gramEnd"/>
+      <w:r>
+        <w:t>. If any provision of this Agreement is held to be invalid or unenforceable, the remaining provisions shall continue in full force and effect.</w:t>
       </w:r>
     </w:p>
     <w:p>
@@ -1192,6 +1634,7 @@
         <w:spacing w:after="80"/>
         <w:ind w:left="454"/>
       </w:pPr>
+      <w:proofErr w:type="gramStart"/>
       <w:r>
         <w:rPr>
           <w:b/>
@@ -1199,7 +1642,11 @@
         <w:t xml:space="preserve">12.4  </w:t>
       </w:r>
       <w:r>
-        <w:t>Governing Law. This Agreement shall be governed by and construed in accordance with the laws of the Republic of South Africa.</w:t>
+        <w:t>Governing</w:t>
+      </w:r>
+      <w:proofErr w:type="gramEnd"/>
+      <w:r>
+        <w:t xml:space="preserve"> Law. This Agreement shall be governed by and construed in accordance with the laws of the Republic of South Africa.</w:t>
       </w:r>
     </w:p>
     <w:p>
@@ -1207,6 +1654,7 @@
         <w:spacing w:after="80"/>
         <w:ind w:left="454"/>
       </w:pPr>
+      <w:proofErr w:type="gramStart"/>
       <w:r>
         <w:rPr>
           <w:b/>
@@ -1214,7 +1662,11 @@
         <w:t xml:space="preserve">12.5  </w:t>
       </w:r>
       <w:r>
-        <w:t>Jurisdiction. The Parties submit to the non-exclusive jurisdiction of the High Court of South Africa, [Gauteng Division, Johannesburg].</w:t>
+        <w:t>Jurisdiction</w:t>
+      </w:r>
+      <w:proofErr w:type="gramEnd"/>
+      <w:r>
+        <w:t>. The Parties submit to the non-exclusive jurisdiction of the High Court of South Africa, [Gauteng Division, Johannesburg].</w:t>
       </w:r>
     </w:p>
     <w:p>
@@ -1222,6 +1674,7 @@
         <w:spacing w:after="80"/>
         <w:ind w:left="454"/>
       </w:pPr>
+      <w:proofErr w:type="gramStart"/>
       <w:r>
         <w:rPr>
           <w:b/>
@@ -1229,7 +1682,11 @@
         <w:t xml:space="preserve">12.6  </w:t>
       </w:r>
       <w:r>
-        <w:t>Dispute Resolution. Any dispute arising out of or in connection with this Agreement shall first be referred to the Parties' respective representatives for good-faith negotiation, failing which the dispute shall be referred to mediation, and failing which to arbitration in accordance with the rules of the Arbitration Foundation of Southern Africa (AFSA).</w:t>
+        <w:t>Dispute</w:t>
+      </w:r>
+      <w:proofErr w:type="gramEnd"/>
+      <w:r>
+        <w:t xml:space="preserve"> Resolution. Any dispute arising out of or in connection with this Agreement shall first be referred to the Parties' respective representatives for good-faith negotiation, failing which the dispute shall be referred to mediation, and failing which to arbitration in accordance with the rules of the Arbitration Foundation of Southern Africa (AFSA).</w:t>
       </w:r>
     </w:p>
     <w:p>
@@ -1237,6 +1694,7 @@
         <w:spacing w:after="80"/>
         <w:ind w:left="454"/>
       </w:pPr>
+      <w:proofErr w:type="gramStart"/>
       <w:r>
         <w:rPr>
           <w:b/>
@@ -1244,7 +1702,11 @@
         <w:t xml:space="preserve">12.7  </w:t>
       </w:r>
       <w:r>
-        <w:t>Notices. All notices under this Agreement shall be in writing and delivered to the addresses set out at the head of this Agreement, or such other address as a Party may from time to time notify the other Party in writing.</w:t>
+        <w:t>Notices</w:t>
+      </w:r>
+      <w:proofErr w:type="gramEnd"/>
+      <w:r>
+        <w:t>. All notices under this Agreement shall be in writing and delivered to the addresses set out at the head of this Agreement, or such other address as a Party may from time to time notify the other Party in writing.</w:t>
       </w:r>
     </w:p>
     <w:p>
@@ -1252,6 +1714,7 @@
         <w:spacing w:after="80"/>
         <w:ind w:left="454"/>
       </w:pPr>
+      <w:proofErr w:type="gramStart"/>
       <w:r>
         <w:rPr>
           <w:b/>
@@ -1259,7 +1722,11 @@
         <w:t xml:space="preserve">12.8  </w:t>
       </w:r>
       <w:r>
-        <w:t>Costs. Each Party shall bear its own legal costs in respect of the negotiation and conclusion of this Agreement, save that the Company shall bear the costs of any registrations or filings required to perfect title to the Assigned IP.</w:t>
+        <w:t>Costs</w:t>
+      </w:r>
+      <w:proofErr w:type="gramEnd"/>
+      <w:r>
+        <w:t>. Each Party shall bear its own legal costs in respect of the negotiation and conclusion of this Agreement, save that the Company shall bear the costs of any registrations or filings required to perfect title to the Assigned IP.</w:t>
       </w:r>
     </w:p>
     <w:p>
@@ -1267,6 +1734,7 @@
         <w:spacing w:after="80"/>
         <w:ind w:left="454"/>
       </w:pPr>
+      <w:proofErr w:type="gramStart"/>
       <w:r>
         <w:rPr>
           <w:b/>
@@ -1274,7 +1742,11 @@
         <w:t xml:space="preserve">12.9  </w:t>
       </w:r>
       <w:r>
-        <w:t>Counterparts. This Agreement may be signed in counterparts, each of which shall constitute an original and which together shall constitute one and the same agreement. Electronic signatures shall be valid and binding.</w:t>
+        <w:t>Counterparts</w:t>
+      </w:r>
+      <w:proofErr w:type="gramEnd"/>
+      <w:r>
+        <w:t>. This Agreement may be signed in counterparts, each of which shall constitute an original and which together shall constitute one and the same agreement. Electronic signatures shall be valid and binding.</w:t>
       </w:r>
     </w:p>
     <w:p/>
@@ -1597,7 +2069,21 @@
               <w:rPr>
                 <w:sz w:val="20"/>
               </w:rPr>
-              <w:t>All Supabase edge functions (Deno/TypeScript)</w:t>
+              <w:t xml:space="preserve">All </w:t>
+            </w:r>
+            <w:proofErr w:type="spellStart"/>
+            <w:r>
+              <w:rPr>
+                <w:sz w:val="20"/>
+              </w:rPr>
+              <w:t>Supabase</w:t>
+            </w:r>
+            <w:proofErr w:type="spellEnd"/>
+            <w:r>
+              <w:rPr>
+                <w:sz w:val="20"/>
+              </w:rPr>
+              <w:t xml:space="preserve"> edge functions (Deno/TypeScript)</w:t>
             </w:r>
           </w:p>
         </w:tc>
@@ -1660,11 +2146,19 @@
             <w:pPr>
               <w:cnfStyle w:val="000000100000" w:firstRow="0" w:lastRow="0" w:firstColumn="0" w:lastColumn="0" w:oddVBand="0" w:evenVBand="0" w:oddHBand="1" w:evenHBand="0" w:firstRowFirstColumn="0" w:firstRowLastColumn="0" w:lastRowFirstColumn="0" w:lastRowLastColumn="0"/>
             </w:pPr>
-            <w:r>
-              <w:rPr>
-                <w:sz w:val="20"/>
-              </w:rPr>
-              <w:t>supabase/migrations/</w:t>
+            <w:proofErr w:type="spellStart"/>
+            <w:r>
+              <w:rPr>
+                <w:sz w:val="20"/>
+              </w:rPr>
+              <w:t>supabase</w:t>
+            </w:r>
+            <w:proofErr w:type="spellEnd"/>
+            <w:r>
+              <w:rPr>
+                <w:sz w:val="20"/>
+              </w:rPr>
+              <w:t>/migrations/</w:t>
             </w:r>
           </w:p>
         </w:tc>
@@ -1711,11 +2205,19 @@
             <w:pPr>
               <w:cnfStyle w:val="000000010000" w:firstRow="0" w:lastRow="0" w:firstColumn="0" w:lastColumn="0" w:oddVBand="0" w:evenVBand="0" w:oddHBand="0" w:evenHBand="1" w:firstRowFirstColumn="0" w:firstRowLastColumn="0" w:lastRowFirstColumn="0" w:lastRowLastColumn="0"/>
             </w:pPr>
-            <w:r>
-              <w:rPr>
-                <w:sz w:val="20"/>
-              </w:rPr>
-              <w:t>ui/ and docs/</w:t>
+            <w:proofErr w:type="spellStart"/>
+            <w:r>
+              <w:rPr>
+                <w:sz w:val="20"/>
+              </w:rPr>
+              <w:t>ui</w:t>
+            </w:r>
+            <w:proofErr w:type="spellEnd"/>
+            <w:r>
+              <w:rPr>
+                <w:sz w:val="20"/>
+              </w:rPr>
+              <w:t>/ and docs/</w:t>
             </w:r>
           </w:p>
         </w:tc>
@@ -1734,7 +2236,21 @@
               <w:rPr>
                 <w:sz w:val="20"/>
               </w:rPr>
-              <w:t>Source Code — Backtest Engine</w:t>
+              <w:t xml:space="preserve">Source Code — </w:t>
+            </w:r>
+            <w:proofErr w:type="spellStart"/>
+            <w:r>
+              <w:rPr>
+                <w:sz w:val="20"/>
+              </w:rPr>
+              <w:t>Backtest</w:t>
+            </w:r>
+            <w:proofErr w:type="spellEnd"/>
+            <w:r>
+              <w:rPr>
+                <w:sz w:val="20"/>
+              </w:rPr>
+              <w:t xml:space="preserve"> Engine</w:t>
             </w:r>
           </w:p>
         </w:tc>
@@ -1762,11 +2278,19 @@
             <w:pPr>
               <w:cnfStyle w:val="000000100000" w:firstRow="0" w:lastRow="0" w:firstColumn="0" w:lastColumn="0" w:oddVBand="0" w:evenVBand="0" w:oddHBand="1" w:evenHBand="0" w:firstRowFirstColumn="0" w:firstRowLastColumn="0" w:lastRowFirstColumn="0" w:lastRowLastColumn="0"/>
             </w:pPr>
-            <w:r>
-              <w:rPr>
-                <w:sz w:val="20"/>
-              </w:rPr>
-              <w:t>supabase/functions/_shared/</w:t>
+            <w:proofErr w:type="spellStart"/>
+            <w:r>
+              <w:rPr>
+                <w:sz w:val="20"/>
+              </w:rPr>
+              <w:t>supabase</w:t>
+            </w:r>
+            <w:proofErr w:type="spellEnd"/>
+            <w:r>
+              <w:rPr>
+                <w:sz w:val="20"/>
+              </w:rPr>
+              <w:t>/functions/_shared/</w:t>
             </w:r>
           </w:p>
         </w:tc>
@@ -1954,7 +2478,35 @@
               <w:rPr>
                 <w:sz w:val="20"/>
               </w:rPr>
-              <w:t>GitHub, Supabase, CryptoQuant, VALR, Resend, Netlify</w:t>
+              <w:t xml:space="preserve">GitHub, </w:t>
+            </w:r>
+            <w:proofErr w:type="spellStart"/>
+            <w:r>
+              <w:rPr>
+                <w:sz w:val="20"/>
+              </w:rPr>
+              <w:t>Supabase</w:t>
+            </w:r>
+            <w:proofErr w:type="spellEnd"/>
+            <w:r>
+              <w:rPr>
+                <w:sz w:val="20"/>
+              </w:rPr>
+              <w:t xml:space="preserve">, </w:t>
+            </w:r>
+            <w:proofErr w:type="spellStart"/>
+            <w:r>
+              <w:rPr>
+                <w:sz w:val="20"/>
+              </w:rPr>
+              <w:t>CryptoQuant</w:t>
+            </w:r>
+            <w:proofErr w:type="spellEnd"/>
+            <w:r>
+              <w:rPr>
+                <w:sz w:val="20"/>
+              </w:rPr>
+              <w:t>, VALR, Resend, Netlify</w:t>
             </w:r>
           </w:p>
         </w:tc>
@@ -2127,12 +2679,14 @@
             <w:tcW w:w="3402" w:type="dxa"/>
           </w:tcPr>
           <w:p>
+            <w:proofErr w:type="spellStart"/>
             <w:r>
               <w:rPr>
                 <w:sz w:val="20"/>
               </w:rPr>
               <w:t>ef_fetch_ci_bands</w:t>
             </w:r>
+            <w:proofErr w:type="spellEnd"/>
           </w:p>
         </w:tc>
         <w:tc>
@@ -2159,11 +2713,33 @@
             <w:pPr>
               <w:cnfStyle w:val="000000100000" w:firstRow="0" w:lastRow="0" w:firstColumn="0" w:lastColumn="0" w:oddVBand="0" w:evenVBand="0" w:oddHBand="1" w:evenHBand="0" w:firstRowFirstColumn="0" w:firstRowLastColumn="0" w:lastRowFirstColumn="0" w:lastRowLastColumn="0"/>
             </w:pPr>
-            <w:r>
-              <w:rPr>
-                <w:sz w:val="20"/>
-              </w:rPr>
-              <w:t>supabase/functions/ef_fetch_ci_bands/</w:t>
+            <w:proofErr w:type="spellStart"/>
+            <w:r>
+              <w:rPr>
+                <w:sz w:val="20"/>
+              </w:rPr>
+              <w:t>supabase</w:t>
+            </w:r>
+            <w:proofErr w:type="spellEnd"/>
+            <w:r>
+              <w:rPr>
+                <w:sz w:val="20"/>
+              </w:rPr>
+              <w:t>/functions/</w:t>
+            </w:r>
+            <w:proofErr w:type="spellStart"/>
+            <w:r>
+              <w:rPr>
+                <w:sz w:val="20"/>
+              </w:rPr>
+              <w:t>ef_fetch_ci_bands</w:t>
+            </w:r>
+            <w:proofErr w:type="spellEnd"/>
+            <w:r>
+              <w:rPr>
+                <w:sz w:val="20"/>
+              </w:rPr>
+              <w:t>/</w:t>
             </w:r>
           </w:p>
         </w:tc>
@@ -2178,12 +2754,14 @@
             <w:tcW w:w="3402" w:type="dxa"/>
           </w:tcPr>
           <w:p>
+            <w:proofErr w:type="spellStart"/>
             <w:r>
               <w:rPr>
                 <w:sz w:val="20"/>
               </w:rPr>
               <w:t>ef_generate_decisions</w:t>
             </w:r>
+            <w:proofErr w:type="spellEnd"/>
           </w:p>
         </w:tc>
         <w:tc>
@@ -2210,11 +2788,33 @@
             <w:pPr>
               <w:cnfStyle w:val="000000010000" w:firstRow="0" w:lastRow="0" w:firstColumn="0" w:lastColumn="0" w:oddVBand="0" w:evenVBand="0" w:oddHBand="0" w:evenHBand="1" w:firstRowFirstColumn="0" w:firstRowLastColumn="0" w:lastRowFirstColumn="0" w:lastRowLastColumn="0"/>
             </w:pPr>
-            <w:r>
-              <w:rPr>
-                <w:sz w:val="20"/>
-              </w:rPr>
-              <w:t>supabase/functions/ef_generate_decisions/</w:t>
+            <w:proofErr w:type="spellStart"/>
+            <w:r>
+              <w:rPr>
+                <w:sz w:val="20"/>
+              </w:rPr>
+              <w:t>supabase</w:t>
+            </w:r>
+            <w:proofErr w:type="spellEnd"/>
+            <w:r>
+              <w:rPr>
+                <w:sz w:val="20"/>
+              </w:rPr>
+              <w:t>/functions/</w:t>
+            </w:r>
+            <w:proofErr w:type="spellStart"/>
+            <w:r>
+              <w:rPr>
+                <w:sz w:val="20"/>
+              </w:rPr>
+              <w:t>ef_generate_decisions</w:t>
+            </w:r>
+            <w:proofErr w:type="spellEnd"/>
+            <w:r>
+              <w:rPr>
+                <w:sz w:val="20"/>
+              </w:rPr>
+              <w:t>/</w:t>
             </w:r>
           </w:p>
         </w:tc>
@@ -2229,12 +2829,14 @@
             <w:tcW w:w="3402" w:type="dxa"/>
           </w:tcPr>
           <w:p>
+            <w:proofErr w:type="spellStart"/>
             <w:r>
               <w:rPr>
                 <w:sz w:val="20"/>
               </w:rPr>
               <w:t>ef_create_order_intents</w:t>
             </w:r>
+            <w:proofErr w:type="spellEnd"/>
           </w:p>
         </w:tc>
         <w:tc>
@@ -2261,11 +2863,33 @@
             <w:pPr>
               <w:cnfStyle w:val="000000100000" w:firstRow="0" w:lastRow="0" w:firstColumn="0" w:lastColumn="0" w:oddVBand="0" w:evenVBand="0" w:oddHBand="1" w:evenHBand="0" w:firstRowFirstColumn="0" w:firstRowLastColumn="0" w:lastRowFirstColumn="0" w:lastRowLastColumn="0"/>
             </w:pPr>
-            <w:r>
-              <w:rPr>
-                <w:sz w:val="20"/>
-              </w:rPr>
-              <w:t>supabase/functions/ef_create_order_intents/</w:t>
+            <w:proofErr w:type="spellStart"/>
+            <w:r>
+              <w:rPr>
+                <w:sz w:val="20"/>
+              </w:rPr>
+              <w:t>supabase</w:t>
+            </w:r>
+            <w:proofErr w:type="spellEnd"/>
+            <w:r>
+              <w:rPr>
+                <w:sz w:val="20"/>
+              </w:rPr>
+              <w:t>/functions/</w:t>
+            </w:r>
+            <w:proofErr w:type="spellStart"/>
+            <w:r>
+              <w:rPr>
+                <w:sz w:val="20"/>
+              </w:rPr>
+              <w:t>ef_create_order_intents</w:t>
+            </w:r>
+            <w:proofErr w:type="spellEnd"/>
+            <w:r>
+              <w:rPr>
+                <w:sz w:val="20"/>
+              </w:rPr>
+              <w:t>/</w:t>
             </w:r>
           </w:p>
         </w:tc>
@@ -2280,12 +2904,14 @@
             <w:tcW w:w="3402" w:type="dxa"/>
           </w:tcPr>
           <w:p>
+            <w:proofErr w:type="spellStart"/>
             <w:r>
               <w:rPr>
                 <w:sz w:val="20"/>
               </w:rPr>
               <w:t>ef_execute_orders</w:t>
             </w:r>
+            <w:proofErr w:type="spellEnd"/>
           </w:p>
         </w:tc>
         <w:tc>
@@ -2312,11 +2938,33 @@
             <w:pPr>
               <w:cnfStyle w:val="000000010000" w:firstRow="0" w:lastRow="0" w:firstColumn="0" w:lastColumn="0" w:oddVBand="0" w:evenVBand="0" w:oddHBand="0" w:evenHBand="1" w:firstRowFirstColumn="0" w:firstRowLastColumn="0" w:lastRowFirstColumn="0" w:lastRowLastColumn="0"/>
             </w:pPr>
-            <w:r>
-              <w:rPr>
-                <w:sz w:val="20"/>
-              </w:rPr>
-              <w:t>supabase/functions/ef_execute_orders/</w:t>
+            <w:proofErr w:type="spellStart"/>
+            <w:r>
+              <w:rPr>
+                <w:sz w:val="20"/>
+              </w:rPr>
+              <w:t>supabase</w:t>
+            </w:r>
+            <w:proofErr w:type="spellEnd"/>
+            <w:r>
+              <w:rPr>
+                <w:sz w:val="20"/>
+              </w:rPr>
+              <w:t>/functions/</w:t>
+            </w:r>
+            <w:proofErr w:type="spellStart"/>
+            <w:r>
+              <w:rPr>
+                <w:sz w:val="20"/>
+              </w:rPr>
+              <w:t>ef_execute_orders</w:t>
+            </w:r>
+            <w:proofErr w:type="spellEnd"/>
+            <w:r>
+              <w:rPr>
+                <w:sz w:val="20"/>
+              </w:rPr>
+              <w:t>/</w:t>
             </w:r>
           </w:p>
         </w:tc>
@@ -2331,12 +2979,14 @@
             <w:tcW w:w="3402" w:type="dxa"/>
           </w:tcPr>
           <w:p>
+            <w:proofErr w:type="spellStart"/>
             <w:r>
               <w:rPr>
                 <w:sz w:val="20"/>
               </w:rPr>
               <w:t>ef_poll_orders</w:t>
             </w:r>
+            <w:proofErr w:type="spellEnd"/>
           </w:p>
         </w:tc>
         <w:tc>
@@ -2363,11 +3013,33 @@
             <w:pPr>
               <w:cnfStyle w:val="000000100000" w:firstRow="0" w:lastRow="0" w:firstColumn="0" w:lastColumn="0" w:oddVBand="0" w:evenVBand="0" w:oddHBand="1" w:evenHBand="0" w:firstRowFirstColumn="0" w:firstRowLastColumn="0" w:lastRowFirstColumn="0" w:lastRowLastColumn="0"/>
             </w:pPr>
-            <w:r>
-              <w:rPr>
-                <w:sz w:val="20"/>
-              </w:rPr>
-              <w:t>supabase/functions/ef_poll_orders/</w:t>
+            <w:proofErr w:type="spellStart"/>
+            <w:r>
+              <w:rPr>
+                <w:sz w:val="20"/>
+              </w:rPr>
+              <w:t>supabase</w:t>
+            </w:r>
+            <w:proofErr w:type="spellEnd"/>
+            <w:r>
+              <w:rPr>
+                <w:sz w:val="20"/>
+              </w:rPr>
+              <w:t>/functions/</w:t>
+            </w:r>
+            <w:proofErr w:type="spellStart"/>
+            <w:r>
+              <w:rPr>
+                <w:sz w:val="20"/>
+              </w:rPr>
+              <w:t>ef_poll_orders</w:t>
+            </w:r>
+            <w:proofErr w:type="spellEnd"/>
+            <w:r>
+              <w:rPr>
+                <w:sz w:val="20"/>
+              </w:rPr>
+              <w:t>/</w:t>
             </w:r>
           </w:p>
         </w:tc>
@@ -2382,12 +3054,14 @@
             <w:tcW w:w="3402" w:type="dxa"/>
           </w:tcPr>
           <w:p>
+            <w:proofErr w:type="spellStart"/>
             <w:r>
               <w:rPr>
                 <w:sz w:val="20"/>
               </w:rPr>
               <w:t>ef_post_ledger_and_balances</w:t>
             </w:r>
+            <w:proofErr w:type="spellEnd"/>
           </w:p>
         </w:tc>
         <w:tc>
@@ -2414,11 +3088,33 @@
             <w:pPr>
               <w:cnfStyle w:val="000000010000" w:firstRow="0" w:lastRow="0" w:firstColumn="0" w:lastColumn="0" w:oddVBand="0" w:evenVBand="0" w:oddHBand="0" w:evenHBand="1" w:firstRowFirstColumn="0" w:firstRowLastColumn="0" w:lastRowFirstColumn="0" w:lastRowLastColumn="0"/>
             </w:pPr>
-            <w:r>
-              <w:rPr>
-                <w:sz w:val="20"/>
-              </w:rPr>
-              <w:t>supabase/functions/ef_post_ledger_and_balances/</w:t>
+            <w:proofErr w:type="spellStart"/>
+            <w:r>
+              <w:rPr>
+                <w:sz w:val="20"/>
+              </w:rPr>
+              <w:t>supabase</w:t>
+            </w:r>
+            <w:proofErr w:type="spellEnd"/>
+            <w:r>
+              <w:rPr>
+                <w:sz w:val="20"/>
+              </w:rPr>
+              <w:t>/functions/</w:t>
+            </w:r>
+            <w:proofErr w:type="spellStart"/>
+            <w:r>
+              <w:rPr>
+                <w:sz w:val="20"/>
+              </w:rPr>
+              <w:t>ef_post_ledger_and_balances</w:t>
+            </w:r>
+            <w:proofErr w:type="spellEnd"/>
+            <w:r>
+              <w:rPr>
+                <w:sz w:val="20"/>
+              </w:rPr>
+              <w:t>/</w:t>
             </w:r>
           </w:p>
         </w:tc>
@@ -2433,12 +3129,14 @@
             <w:tcW w:w="3402" w:type="dxa"/>
           </w:tcPr>
           <w:p>
+            <w:proofErr w:type="spellStart"/>
             <w:r>
               <w:rPr>
                 <w:sz w:val="20"/>
               </w:rPr>
               <w:t>ef_alert_digest</w:t>
             </w:r>
+            <w:proofErr w:type="spellEnd"/>
           </w:p>
         </w:tc>
         <w:tc>
@@ -2465,11 +3163,33 @@
             <w:pPr>
               <w:cnfStyle w:val="000000100000" w:firstRow="0" w:lastRow="0" w:firstColumn="0" w:lastColumn="0" w:oddVBand="0" w:evenVBand="0" w:oddHBand="1" w:evenHBand="0" w:firstRowFirstColumn="0" w:firstRowLastColumn="0" w:lastRowFirstColumn="0" w:lastRowLastColumn="0"/>
             </w:pPr>
-            <w:r>
-              <w:rPr>
-                <w:sz w:val="20"/>
-              </w:rPr>
-              <w:t>supabase/functions/ef_alert_digest/</w:t>
+            <w:proofErr w:type="spellStart"/>
+            <w:r>
+              <w:rPr>
+                <w:sz w:val="20"/>
+              </w:rPr>
+              <w:t>supabase</w:t>
+            </w:r>
+            <w:proofErr w:type="spellEnd"/>
+            <w:r>
+              <w:rPr>
+                <w:sz w:val="20"/>
+              </w:rPr>
+              <w:t>/functions/</w:t>
+            </w:r>
+            <w:proofErr w:type="spellStart"/>
+            <w:r>
+              <w:rPr>
+                <w:sz w:val="20"/>
+              </w:rPr>
+              <w:t>ef_alert_digest</w:t>
+            </w:r>
+            <w:proofErr w:type="spellEnd"/>
+            <w:r>
+              <w:rPr>
+                <w:sz w:val="20"/>
+              </w:rPr>
+              <w:t>/</w:t>
             </w:r>
           </w:p>
         </w:tc>
@@ -2484,12 +3204,14 @@
             <w:tcW w:w="3402" w:type="dxa"/>
           </w:tcPr>
           <w:p>
+            <w:proofErr w:type="spellStart"/>
             <w:r>
               <w:rPr>
                 <w:sz w:val="20"/>
               </w:rPr>
               <w:t>ef_valr_ws_monitor</w:t>
             </w:r>
+            <w:proofErr w:type="spellEnd"/>
           </w:p>
         </w:tc>
         <w:tc>
@@ -2516,11 +3238,33 @@
             <w:pPr>
               <w:cnfStyle w:val="000000010000" w:firstRow="0" w:lastRow="0" w:firstColumn="0" w:lastColumn="0" w:oddVBand="0" w:evenVBand="0" w:oddHBand="0" w:evenHBand="1" w:firstRowFirstColumn="0" w:firstRowLastColumn="0" w:lastRowFirstColumn="0" w:lastRowLastColumn="0"/>
             </w:pPr>
-            <w:r>
-              <w:rPr>
-                <w:sz w:val="20"/>
-              </w:rPr>
-              <w:t>supabase/functions/ef_valr_ws_monitor/</w:t>
+            <w:proofErr w:type="spellStart"/>
+            <w:r>
+              <w:rPr>
+                <w:sz w:val="20"/>
+              </w:rPr>
+              <w:t>supabase</w:t>
+            </w:r>
+            <w:proofErr w:type="spellEnd"/>
+            <w:r>
+              <w:rPr>
+                <w:sz w:val="20"/>
+              </w:rPr>
+              <w:t>/functions/</w:t>
+            </w:r>
+            <w:proofErr w:type="spellStart"/>
+            <w:r>
+              <w:rPr>
+                <w:sz w:val="20"/>
+              </w:rPr>
+              <w:t>ef_valr_ws_monitor</w:t>
+            </w:r>
+            <w:proofErr w:type="spellEnd"/>
+            <w:r>
+              <w:rPr>
+                <w:sz w:val="20"/>
+              </w:rPr>
+              <w:t>/</w:t>
             </w:r>
           </w:p>
         </w:tc>
@@ -2535,12 +3279,14 @@
             <w:tcW w:w="3402" w:type="dxa"/>
           </w:tcPr>
           <w:p>
+            <w:proofErr w:type="spellStart"/>
             <w:r>
               <w:rPr>
                 <w:sz w:val="20"/>
               </w:rPr>
               <w:t>ef_resume_pipeline</w:t>
             </w:r>
+            <w:proofErr w:type="spellEnd"/>
           </w:p>
         </w:tc>
         <w:tc>
@@ -2567,11 +3313,33 @@
             <w:pPr>
               <w:cnfStyle w:val="000000100000" w:firstRow="0" w:lastRow="0" w:firstColumn="0" w:lastColumn="0" w:oddVBand="0" w:evenVBand="0" w:oddHBand="1" w:evenHBand="0" w:firstRowFirstColumn="0" w:firstRowLastColumn="0" w:lastRowFirstColumn="0" w:lastRowLastColumn="0"/>
             </w:pPr>
-            <w:r>
-              <w:rPr>
-                <w:sz w:val="20"/>
-              </w:rPr>
-              <w:t>supabase/functions/ef_resume_pipeline/</w:t>
+            <w:proofErr w:type="spellStart"/>
+            <w:r>
+              <w:rPr>
+                <w:sz w:val="20"/>
+              </w:rPr>
+              <w:t>supabase</w:t>
+            </w:r>
+            <w:proofErr w:type="spellEnd"/>
+            <w:r>
+              <w:rPr>
+                <w:sz w:val="20"/>
+              </w:rPr>
+              <w:t>/functions/</w:t>
+            </w:r>
+            <w:proofErr w:type="spellStart"/>
+            <w:r>
+              <w:rPr>
+                <w:sz w:val="20"/>
+              </w:rPr>
+              <w:t>ef_resume_pipeline</w:t>
+            </w:r>
+            <w:proofErr w:type="spellEnd"/>
+            <w:r>
+              <w:rPr>
+                <w:sz w:val="20"/>
+              </w:rPr>
+              <w:t>/</w:t>
             </w:r>
           </w:p>
         </w:tc>
@@ -2586,12 +3354,14 @@
             <w:tcW w:w="3402" w:type="dxa"/>
           </w:tcPr>
           <w:p>
+            <w:proofErr w:type="spellStart"/>
             <w:r>
               <w:rPr>
                 <w:sz w:val="20"/>
               </w:rPr>
               <w:t>ef_run_lth_pvr_simulator</w:t>
             </w:r>
+            <w:proofErr w:type="spellEnd"/>
           </w:p>
         </w:tc>
         <w:tc>
@@ -2606,7 +3376,21 @@
               <w:rPr>
                 <w:sz w:val="20"/>
               </w:rPr>
-              <w:t>Edge Function (Backtest)</w:t>
+              <w:t>Edge Function (</w:t>
+            </w:r>
+            <w:proofErr w:type="spellStart"/>
+            <w:r>
+              <w:rPr>
+                <w:sz w:val="20"/>
+              </w:rPr>
+              <w:t>Backtest</w:t>
+            </w:r>
+            <w:proofErr w:type="spellEnd"/>
+            <w:r>
+              <w:rPr>
+                <w:sz w:val="20"/>
+              </w:rPr>
+              <w:t>)</w:t>
             </w:r>
           </w:p>
         </w:tc>
@@ -2618,11 +3402,33 @@
             <w:pPr>
               <w:cnfStyle w:val="000000010000" w:firstRow="0" w:lastRow="0" w:firstColumn="0" w:lastColumn="0" w:oddVBand="0" w:evenVBand="0" w:oddHBand="0" w:evenHBand="1" w:firstRowFirstColumn="0" w:firstRowLastColumn="0" w:lastRowFirstColumn="0" w:lastRowLastColumn="0"/>
             </w:pPr>
-            <w:r>
-              <w:rPr>
-                <w:sz w:val="20"/>
-              </w:rPr>
-              <w:t>supabase/functions/ef_run_lth_pvr_simulator/</w:t>
+            <w:proofErr w:type="spellStart"/>
+            <w:r>
+              <w:rPr>
+                <w:sz w:val="20"/>
+              </w:rPr>
+              <w:t>supabase</w:t>
+            </w:r>
+            <w:proofErr w:type="spellEnd"/>
+            <w:r>
+              <w:rPr>
+                <w:sz w:val="20"/>
+              </w:rPr>
+              <w:t>/functions/</w:t>
+            </w:r>
+            <w:proofErr w:type="spellStart"/>
+            <w:r>
+              <w:rPr>
+                <w:sz w:val="20"/>
+              </w:rPr>
+              <w:t>ef_run_lth_pvr_simulator</w:t>
+            </w:r>
+            <w:proofErr w:type="spellEnd"/>
+            <w:r>
+              <w:rPr>
+                <w:sz w:val="20"/>
+              </w:rPr>
+              <w:t>/</w:t>
             </w:r>
           </w:p>
         </w:tc>
@@ -2637,12 +3443,14 @@
             <w:tcW w:w="3402" w:type="dxa"/>
           </w:tcPr>
           <w:p>
+            <w:proofErr w:type="spellStart"/>
             <w:r>
               <w:rPr>
                 <w:sz w:val="20"/>
               </w:rPr>
               <w:t>lth_pvr_simulator.ts</w:t>
             </w:r>
+            <w:proofErr w:type="spellEnd"/>
           </w:p>
         </w:tc>
         <w:tc>
@@ -2669,12 +3477,28 @@
             <w:pPr>
               <w:cnfStyle w:val="000000100000" w:firstRow="0" w:lastRow="0" w:firstColumn="0" w:lastColumn="0" w:oddVBand="0" w:evenVBand="0" w:oddHBand="1" w:evenHBand="0" w:firstRowFirstColumn="0" w:firstRowLastColumn="0" w:lastRowFirstColumn="0" w:lastRowLastColumn="0"/>
             </w:pPr>
-            <w:r>
-              <w:rPr>
-                <w:sz w:val="20"/>
-              </w:rPr>
-              <w:t>supabase/functions/_shared/lth_pvr_simulator.ts</w:t>
-            </w:r>
+            <w:proofErr w:type="spellStart"/>
+            <w:r>
+              <w:rPr>
+                <w:sz w:val="20"/>
+              </w:rPr>
+              <w:t>supabase</w:t>
+            </w:r>
+            <w:proofErr w:type="spellEnd"/>
+            <w:r>
+              <w:rPr>
+                <w:sz w:val="20"/>
+              </w:rPr>
+              <w:t>/functions/_shared/</w:t>
+            </w:r>
+            <w:proofErr w:type="spellStart"/>
+            <w:r>
+              <w:rPr>
+                <w:sz w:val="20"/>
+              </w:rPr>
+              <w:t>lth_pvr_simulator.ts</w:t>
+            </w:r>
+            <w:proofErr w:type="spellEnd"/>
           </w:p>
         </w:tc>
       </w:tr>
@@ -2724,8 +3548,30 @@
               <w:rPr>
                 <w:sz w:val="20"/>
               </w:rPr>
-              <w:t>public, lth_pvr, lth_pvr_bt</w:t>
-            </w:r>
+              <w:t xml:space="preserve">public, </w:t>
+            </w:r>
+            <w:proofErr w:type="spellStart"/>
+            <w:r>
+              <w:rPr>
+                <w:sz w:val="20"/>
+              </w:rPr>
+              <w:t>lth_pvr</w:t>
+            </w:r>
+            <w:proofErr w:type="spellEnd"/>
+            <w:r>
+              <w:rPr>
+                <w:sz w:val="20"/>
+              </w:rPr>
+              <w:t xml:space="preserve">, </w:t>
+            </w:r>
+            <w:proofErr w:type="spellStart"/>
+            <w:r>
+              <w:rPr>
+                <w:sz w:val="20"/>
+              </w:rPr>
+              <w:t>lth_pvr_bt</w:t>
+            </w:r>
+            <w:proofErr w:type="spellEnd"/>
           </w:p>
         </w:tc>
       </w:tr>
@@ -2771,11 +3617,19 @@
             <w:pPr>
               <w:cnfStyle w:val="000000100000" w:firstRow="0" w:lastRow="0" w:firstColumn="0" w:lastColumn="0" w:oddVBand="0" w:evenVBand="0" w:oddHBand="1" w:evenHBand="0" w:firstRowFirstColumn="0" w:firstRowLastColumn="0" w:lastRowFirstColumn="0" w:lastRowLastColumn="0"/>
             </w:pPr>
-            <w:r>
-              <w:rPr>
-                <w:sz w:val="20"/>
-              </w:rPr>
-              <w:t>supabase/migrations/</w:t>
+            <w:proofErr w:type="spellStart"/>
+            <w:r>
+              <w:rPr>
+                <w:sz w:val="20"/>
+              </w:rPr>
+              <w:t>supabase</w:t>
+            </w:r>
+            <w:proofErr w:type="spellEnd"/>
+            <w:r>
+              <w:rPr>
+                <w:sz w:val="20"/>
+              </w:rPr>
+              <w:t>/migrations/</w:t>
             </w:r>
           </w:p>
         </w:tc>
@@ -2822,11 +3676,19 @@
             <w:pPr>
               <w:cnfStyle w:val="000000010000" w:firstRow="0" w:lastRow="0" w:firstColumn="0" w:lastColumn="0" w:oddVBand="0" w:evenVBand="0" w:oddHBand="0" w:evenHBand="1" w:firstRowFirstColumn="0" w:firstRowLastColumn="0" w:lastRowFirstColumn="0" w:lastRowLastColumn="0"/>
             </w:pPr>
-            <w:r>
-              <w:rPr>
-                <w:sz w:val="20"/>
-              </w:rPr>
-              <w:t>ui/Advanced BTC DCA Strategy.html</w:t>
+            <w:proofErr w:type="spellStart"/>
+            <w:r>
+              <w:rPr>
+                <w:sz w:val="20"/>
+              </w:rPr>
+              <w:t>ui</w:t>
+            </w:r>
+            <w:proofErr w:type="spellEnd"/>
+            <w:r>
+              <w:rPr>
+                <w:sz w:val="20"/>
+              </w:rPr>
+              <w:t>/Advanced BTC DCA Strategy.html</w:t>
             </w:r>
           </w:p>
         </w:tc>
@@ -3001,12 +3863,14 @@
             <w:tcW w:w="2268" w:type="dxa"/>
           </w:tcPr>
           <w:p>
+            <w:proofErr w:type="spellStart"/>
             <w:r>
               <w:rPr>
                 <w:sz w:val="20"/>
               </w:rPr>
               <w:t>Supabase</w:t>
             </w:r>
+            <w:proofErr w:type="spellEnd"/>
           </w:p>
         </w:tc>
         <w:tc>
@@ -3068,11 +3932,19 @@
             <w:tcW w:w="2268" w:type="dxa"/>
           </w:tcPr>
           <w:p>
-            <w:r>
-              <w:rPr>
-                <w:sz w:val="20"/>
-              </w:rPr>
-              <w:t>CryptoQuant API</w:t>
+            <w:proofErr w:type="spellStart"/>
+            <w:r>
+              <w:rPr>
+                <w:sz w:val="20"/>
+              </w:rPr>
+              <w:t>CryptoQuant</w:t>
+            </w:r>
+            <w:proofErr w:type="spellEnd"/>
+            <w:r>
+              <w:rPr>
+                <w:sz w:val="20"/>
+              </w:rPr>
+              <w:t xml:space="preserve"> API</w:t>
             </w:r>
           </w:p>
         </w:tc>
@@ -3403,11 +4275,19 @@
             <w:tcW w:w="2268" w:type="dxa"/>
           </w:tcPr>
           <w:p>
-            <w:r>
-              <w:rPr>
-                <w:sz w:val="20"/>
-              </w:rPr>
-              <w:t>Supabase JS Client</w:t>
+            <w:proofErr w:type="spellStart"/>
+            <w:r>
+              <w:rPr>
+                <w:sz w:val="20"/>
+              </w:rPr>
+              <w:t>Supabase</w:t>
+            </w:r>
+            <w:proofErr w:type="spellEnd"/>
+            <w:r>
+              <w:rPr>
+                <w:sz w:val="20"/>
+              </w:rPr>
+              <w:t xml:space="preserve"> JS Client</w:t>
             </w:r>
           </w:p>
         </w:tc>
@@ -3730,18 +4610,46 @@
         <w:rPr>
           <w:sz w:val="20"/>
         </w:rPr>
-        <w:t>Annexures A, B, and C must be completed accurately. Any IP omitted from these annexures may give rise to ownership disputes later. Particular care should be taken with: (a) domain name registrations; (b) third-party platform account ownership (especially GitHub, Supabase); (c) any code that may have been written before BitWealth (Pty) Ltd was incorporated.</w:t>
-      </w:r>
-    </w:p>
-    <w:p>
-      <w:pPr>
-        <w:pStyle w:val="ListNumber"/>
-      </w:pPr>
+        <w:t xml:space="preserve">Annexures A, B, and C must be completed accurately. Any IP omitted from these annexures may give rise to ownership disputes later. Particular care should be taken with: (a) domain name registrations; (b) third-party platform account ownership (especially GitHub, </w:t>
+      </w:r>
+      <w:proofErr w:type="spellStart"/>
       <w:r>
         <w:rPr>
           <w:sz w:val="20"/>
         </w:rPr>
-        <w:t>If RocketX, Simon, or any other party will become shareholders of the Company, this Agreement should be signed BEFORE any such shareholding is granted, so that those parties subscribe for shares in a company that already owns the IP.</w:t>
+        <w:t>Supabase</w:t>
+      </w:r>
+      <w:proofErr w:type="spellEnd"/>
+      <w:r>
+        <w:rPr>
+          <w:sz w:val="20"/>
+        </w:rPr>
+        <w:t>); (c) any code that may have been written before BitWealth (Pty) Ltd was incorporated.</w:t>
+      </w:r>
+    </w:p>
+    <w:p>
+      <w:pPr>
+        <w:pStyle w:val="ListNumber"/>
+      </w:pPr>
+      <w:r>
+        <w:rPr>
+          <w:sz w:val="20"/>
+        </w:rPr>
+        <w:t xml:space="preserve">If </w:t>
+      </w:r>
+      <w:proofErr w:type="spellStart"/>
+      <w:r>
+        <w:rPr>
+          <w:sz w:val="20"/>
+        </w:rPr>
+        <w:t>RocketX</w:t>
+      </w:r>
+      <w:proofErr w:type="spellEnd"/>
+      <w:r>
+        <w:rPr>
+          <w:sz w:val="20"/>
+        </w:rPr>
+        <w:t>, Simon, or any other party will become shareholders of the Company, this Agreement should be signed BEFORE any such shareholding is granted, so that those parties subscribe for shares in a company that already owns the IP.</w:t>
       </w:r>
     </w:p>
     <w:p>
@@ -3774,7 +4682,23 @@
         <w:rPr>
           <w:sz w:val="20"/>
         </w:rPr>
-        <w:t>If the Company intends to register any patent, trade mark, or design rights, separate registration applications will be required. This Agreement gives the Company the right to make those applications but does not effect the registrations themselves.</w:t>
+        <w:t xml:space="preserve">If the Company intends to register any patent, trade mark, or design rights, separate registration applications will be required. This Agreement gives the Company the right to make those applications but does not </w:t>
+      </w:r>
+      <w:proofErr w:type="spellStart"/>
+      <w:proofErr w:type="gramStart"/>
+      <w:r>
+        <w:rPr>
+          <w:sz w:val="20"/>
+        </w:rPr>
+        <w:t>effect</w:t>
+      </w:r>
+      <w:proofErr w:type="spellEnd"/>
+      <w:proofErr w:type="gramEnd"/>
+      <w:r>
+        <w:rPr>
+          <w:sz w:val="20"/>
+        </w:rPr>
+        <w:t xml:space="preserve"> the registrations themselves.</w:t>
       </w:r>
     </w:p>
     <w:sectPr>
@@ -4382,6 +5306,7 @@
     <w:rsid w:val="00FC693F"/>
     <w:rPr>
       <w:rFonts w:ascii="Calibri" w:hAnsi="Calibri"/>
+      <w:lang w:val="en-ZA"/>
     </w:rPr>
   </w:style>
   <w:style w:type="paragraph" w:styleId="Heading1">

</xml_diff>